<commit_message>
chore: clean desktop and fill official docx with Leila Miller and member roster
</commit_message>
<xml_diff>
--- a/export_documents/student_club_registration_form_f252_FILLED.docx
+++ b/export_documents/student_club_registration_form_f252_FILLED.docx
@@ -673,7 +673,7 @@
           <w:rFonts w:asciiTheme="minorHAnsi" w:hAnsiTheme="minorHAnsi" w:cstheme="minorHAnsi"/>
           <w:b/>
         </w:rPr>
-        <w:t xml:space="preserve">AEC (Academic and Educational Club): </w:t>
+        <w:t xml:space="preserve">[ X ] AEC (Academic and Educational Club): </w:t>
       </w:r>
       <w:r>
         <w:rPr>
@@ -1016,7 +1016,7 @@
           <w:rFonts w:asciiTheme="minorHAnsi" w:hAnsiTheme="minorHAnsi" w:cstheme="minorHAnsi"/>
           <w:b/>
         </w:rPr>
-        <w:t xml:space="preserve">SRC (Spiritual and Religious Club): </w:t>
+        <w:t xml:space="preserve">[   ] SRC (Spiritual and Religious Club): </w:t>
       </w:r>
       <w:r>
         <w:rPr>
@@ -1135,7 +1135,7 @@
           <w:rFonts w:asciiTheme="minorHAnsi" w:hAnsiTheme="minorHAnsi" w:cstheme="minorHAnsi"/>
           <w:b/>
         </w:rPr>
-        <w:t xml:space="preserve">CC (Cultural Club): </w:t>
+        <w:t xml:space="preserve">[   ] CC (Cultural Club): </w:t>
       </w:r>
       <w:r>
         <w:rPr>
@@ -1201,7 +1201,7 @@
           <w:rFonts w:asciiTheme="minorHAnsi" w:hAnsiTheme="minorHAnsi" w:cstheme="minorHAnsi"/>
           <w:b/>
         </w:rPr>
-        <w:t xml:space="preserve">RSC (Recreation and Sports Club): </w:t>
+        <w:t xml:space="preserve">[   ] RSC (Recreation and Sports Club): </w:t>
       </w:r>
       <w:r>
         <w:rPr>

</xml_diff>

<commit_message>
feat: fill Dean Assoc. Prof. Dr. Altijana Hromic-Jahjefendic and Hasan Kaan Karabulut in official form
</commit_message>
<xml_diff>
--- a/export_documents/student_club_registration_form_f252_FILLED.docx
+++ b/export_documents/student_club_registration_form_f252_FILLED.docx
@@ -2203,7 +2203,7 @@
                 <w:rFonts w:ascii="Calibri"/>
                 <w:sz w:val="22"/>
               </w:rPr>
-              <w:t>Mahmut İhsan Avcı</w:t>
+              <w:t>Hasan Kaan Karabulut</w:t>
             </w:r>
           </w:p>
         </w:tc>
@@ -3543,7 +3543,7 @@
                 <w:rFonts w:ascii="Calibri"/>
                 <w:sz w:val="22"/>
               </w:rPr>
-              <w:t>Hasan Kaan</w:t>
+              <w:t>Hasan Kaan Karabulut</w:t>
             </w:r>
           </w:p>
         </w:tc>
@@ -3567,7 +3567,7 @@
                 <w:rFonts w:ascii="Calibri"/>
                 <w:sz w:val="22"/>
               </w:rPr>
-              <w:t>ufukkarabulut35@gmail.com</w:t>
+              <w:t>hasankaankarabulut121@gmail.com</w:t>
             </w:r>
           </w:p>
         </w:tc>
@@ -5790,6 +5790,13 @@
                 <w:szCs w:val="20"/>
               </w:rPr>
             </w:pPr>
+            <w:r>
+              <w:rPr>
+                <w:rFonts w:ascii="Calibri"/>
+                <w:sz w:val="22"/>
+              </w:rPr>
+              <w:t>Assoc. Prof. Dr. Altijana Hromić-Jahjefendić</w:t>
+            </w:r>
           </w:p>
         </w:tc>
       </w:tr>

</xml_diff>

<commit_message>
feat: complete member roster with confirmed names Nazlican Cebeci, Bakir Sabic, Muhammed Emin Tiryaki, Bekir Enes Cokbekler
</commit_message>
<xml_diff>
--- a/export_documents/student_club_registration_form_f252_FILLED.docx
+++ b/export_documents/student_club_registration_form_f252_FILLED.docx
@@ -3799,7 +3799,7 @@
                 <w:rFonts w:ascii="Calibri"/>
                 <w:sz w:val="22"/>
               </w:rPr>
-              <w:t>46bekir70@gmail.com</w:t>
+              <w:t>becokbekler@student.ius.edu.ba</w:t>
             </w:r>
           </w:p>
         </w:tc>
@@ -4123,7 +4123,7 @@
                 <w:rFonts w:ascii="Calibri"/>
                 <w:sz w:val="22"/>
               </w:rPr>
-              <w:t>Muhammed Emin</w:t>
+              <w:t>Muhammed Emin Tiryaki</w:t>
             </w:r>
           </w:p>
         </w:tc>
@@ -4147,7 +4147,7 @@
                 <w:rFonts w:ascii="Calibri"/>
                 <w:sz w:val="22"/>
               </w:rPr>
-              <w:t>duduck6107@gmail.com</w:t>
+              <w:t>metiryaki@student.ius.edu.ba</w:t>
             </w:r>
           </w:p>
         </w:tc>
@@ -4355,7 +4355,7 @@
                 <w:rFonts w:ascii="Calibri"/>
                 <w:sz w:val="22"/>
               </w:rPr>
-              <w:t>Bakir</w:t>
+              <w:t>Bakir Šabić</w:t>
             </w:r>
           </w:p>
         </w:tc>
@@ -4379,7 +4379,7 @@
                 <w:rFonts w:ascii="Calibri"/>
                 <w:sz w:val="22"/>
               </w:rPr>
-              <w:t>260302030@student.ius.edu.ba</w:t>
+              <w:t>bsabic@student.ius.edu.ba</w:t>
             </w:r>
           </w:p>
         </w:tc>

</xml_diff>

<commit_message>
feat: rebrand club name to IUS Engineering Club (IEC) across all docs, templates and form F252
</commit_message>
<xml_diff>
--- a/export_documents/student_club_registration_form_f252_FILLED.docx
+++ b/export_documents/student_club_registration_form_f252_FILLED.docx
@@ -327,7 +327,7 @@
                 <w:rFonts w:ascii="Calibri"/>
                 <w:sz w:val="22"/>
               </w:rPr>
-              <w:t>IUS Engineering Events Club (IEEC)</w:t>
+              <w:t>IUS Engineering Club (IEC)</w:t>
             </w:r>
           </w:p>
           <w:p ns2:paraId="5A6244DA" ns2:textId="77777777">
@@ -1747,7 +1747,7 @@
                 <w:rFonts w:ascii="Calibri"/>
                 <w:sz w:val="22"/>
               </w:rPr>
-              <w:t>The IUS Engineering Events Club (IEEC) is established as an Academic and Educational Club (AEC) under the Faculty of Engineering and Natural Sciences (FENS) to bridge university engineering education with real-world industrial practice through technical workshops, AI bootcamps, multidisciplinary student engineering project teams, and tech industry networking.</w:t>
+              <w:t>The IUS Engineering Club (IEC) is established as an Academic and Educational Club (AEC) under the Faculty of Engineering and Natural Sciences (FENS) to bridge university engineering education with real-world industrial practice through technical workshops, AI bootcamps, multidisciplinary student engineering project teams, and tech industry networking.</w:t>
             </w:r>
           </w:p>
           <w:p ns2:paraId="35B59F8C" ns2:textId="77777777">

</xml_diff>

<commit_message>
feat: appoint Bakir Basic as PR & Media Lead completing 5/5 Management Board and 10/10 Members
</commit_message>
<xml_diff>
--- a/export_documents/student_club_registration_form_f252_FILLED.docx
+++ b/export_documents/student_club_registration_form_f252_FILLED.docx
@@ -2383,7 +2383,7 @@
                 <w:rFonts w:ascii="Calibri"/>
                 <w:sz w:val="22"/>
               </w:rPr>
-              <w:t>[In Appointment Process / Open Position]</w:t>
+              <w:t>Bakir Bašić</w:t>
             </w:r>
           </w:p>
         </w:tc>
@@ -4355,7 +4355,7 @@
                 <w:rFonts w:ascii="Calibri"/>
                 <w:sz w:val="22"/>
               </w:rPr>
-              <w:t>Bakir Šabić</w:t>
+              <w:t>Bakir Bašić</w:t>
             </w:r>
           </w:p>
         </w:tc>
@@ -4379,7 +4379,7 @@
                 <w:rFonts w:ascii="Calibri"/>
                 <w:sz w:val="22"/>
               </w:rPr>
-              <w:t>bsabic@student.ius.edu.ba</w:t>
+              <w:t>260302030@student.ius.edu.ba</w:t>
             </w:r>
           </w:p>
         </w:tc>

</xml_diff>

<commit_message>
feat: ingest latest form response (Ahmed Hadzimurati) updating docs, templates, and desktop form F252
</commit_message>
<xml_diff>
--- a/export_documents/student_club_registration_form_f252_FILLED.docx
+++ b/export_documents/student_club_registration_form_f252_FILLED.docx
@@ -5140,8 +5140,8 @@
             </w:pPr>
             <w:r>
               <w:rPr>
-                <w:sz w:val="20"/>
-                <w:szCs w:val="20"/>
+                <w:rFonts w:ascii="Calibri"/>
+                <w:sz w:val="22"/>
               </w:rPr>
               <w:t>16</w:t>
             </w:r>
@@ -5162,6 +5162,13 @@
                 <w:szCs w:val="20"/>
               </w:rPr>
             </w:pPr>
+            <w:r>
+              <w:rPr>
+                <w:rFonts w:ascii="Calibri"/>
+                <w:sz w:val="22"/>
+              </w:rPr>
+              <w:t>Ahmed Hadzimurati</w:t>
+            </w:r>
           </w:p>
         </w:tc>
         <w:tc>
@@ -5179,6 +5186,13 @@
                 <w:szCs w:val="20"/>
               </w:rPr>
             </w:pPr>
+            <w:r>
+              <w:rPr>
+                <w:rFonts w:ascii="Calibri"/>
+                <w:sz w:val="22"/>
+              </w:rPr>
+              <w:t>260302051@student.ius.edu.ba</w:t>
+            </w:r>
           </w:p>
         </w:tc>
         <w:tc>
@@ -5196,6 +5210,13 @@
                 <w:szCs w:val="20"/>
               </w:rPr>
             </w:pPr>
+            <w:r>
+              <w:rPr>
+                <w:rFonts w:ascii="Calibri"/>
+                <w:sz w:val="22"/>
+              </w:rPr>
+              <w:t>260302051</w:t>
+            </w:r>
           </w:p>
         </w:tc>
         <w:tc>

</xml_diff>

<commit_message>
feat: confirm advisor Prof. Dr. Leila Miller (Done in Linear) and Social Life Lead M. Efe Ural
</commit_message>
<xml_diff>
--- a/export_documents/student_club_registration_form_f252_FILLED.docx
+++ b/export_documents/student_club_registration_form_f252_FILLED.docx
@@ -3427,7 +3427,7 @@
                 <w:rFonts w:ascii="Calibri"/>
                 <w:sz w:val="22"/>
               </w:rPr>
-              <w:t>Kaan Mete Şenyıldız</w:t>
+              <w:t>Emin Efe Duman</w:t>
             </w:r>
           </w:p>
         </w:tc>
@@ -3451,7 +3451,7 @@
                 <w:rFonts w:ascii="Calibri"/>
                 <w:sz w:val="22"/>
               </w:rPr>
-              <w:t>kmsenyildiz@gmail.com</w:t>
+              <w:t>emnfdmn@gmail.com</w:t>
             </w:r>
           </w:p>
         </w:tc>
@@ -3475,7 +3475,7 @@
                 <w:rFonts w:ascii="Calibri"/>
                 <w:sz w:val="22"/>
               </w:rPr>
-              <w:t>250302201</w:t>
+              <w:t>250302211</w:t>
             </w:r>
           </w:p>
         </w:tc>
@@ -3494,6 +3494,13 @@
                 <w:szCs w:val="20"/>
               </w:rPr>
             </w:pPr>
+            <w:r>
+              <w:rPr>
+                <w:rFonts w:ascii="Calibri"/>
+                <w:sz w:val="22"/>
+              </w:rPr>
+              <w:t/>
+            </w:r>
           </w:p>
         </w:tc>
       </w:tr>
@@ -3543,7 +3550,7 @@
                 <w:rFonts w:ascii="Calibri"/>
                 <w:sz w:val="22"/>
               </w:rPr>
-              <w:t>Hasan Kaan Karabulut</w:t>
+              <w:t>Ahmed Hadzimurati</w:t>
             </w:r>
           </w:p>
         </w:tc>
@@ -3567,7 +3574,7 @@
                 <w:rFonts w:ascii="Calibri"/>
                 <w:sz w:val="22"/>
               </w:rPr>
-              <w:t>hasankaankarabulut121@gmail.com</w:t>
+              <w:t>260302051@student.ius.edu.ba</w:t>
             </w:r>
           </w:p>
         </w:tc>
@@ -3591,7 +3598,7 @@
                 <w:rFonts w:ascii="Calibri"/>
                 <w:sz w:val="22"/>
               </w:rPr>
-              <w:t>250302195</w:t>
+              <w:t>260302051</w:t>
             </w:r>
           </w:p>
         </w:tc>
@@ -3610,6 +3617,13 @@
                 <w:szCs w:val="20"/>
               </w:rPr>
             </w:pPr>
+            <w:r>
+              <w:rPr>
+                <w:rFonts w:ascii="Calibri"/>
+                <w:sz w:val="22"/>
+              </w:rPr>
+              <w:t/>
+            </w:r>
           </w:p>
         </w:tc>
       </w:tr>
@@ -3659,7 +3673,7 @@
                 <w:rFonts w:ascii="Calibri"/>
                 <w:sz w:val="22"/>
               </w:rPr>
-              <w:t>Mahmut İhsan Avcı</w:t>
+              <w:t>Muhammed Efe Ural</w:t>
             </w:r>
           </w:p>
         </w:tc>
@@ -3683,7 +3697,7 @@
                 <w:rFonts w:ascii="Calibri"/>
                 <w:sz w:val="22"/>
               </w:rPr>
-              <w:t>mahmut.ihsanavcii@gmail.com</w:t>
+              <w:t>uralefe10@gmail.com</w:t>
             </w:r>
           </w:p>
         </w:tc>
@@ -3707,7 +3721,7 @@
                 <w:rFonts w:ascii="Calibri"/>
                 <w:sz w:val="22"/>
               </w:rPr>
-              <w:t>250302233</w:t>
+              <w:t>240302169</w:t>
             </w:r>
           </w:p>
         </w:tc>
@@ -3726,6 +3740,13 @@
                 <w:szCs w:val="20"/>
               </w:rPr>
             </w:pPr>
+            <w:r>
+              <w:rPr>
+                <w:rFonts w:ascii="Calibri"/>
+                <w:sz w:val="22"/>
+              </w:rPr>
+              <w:t/>
+            </w:r>
           </w:p>
         </w:tc>
       </w:tr>
@@ -3775,7 +3796,7 @@
                 <w:rFonts w:ascii="Calibri"/>
                 <w:sz w:val="22"/>
               </w:rPr>
-              <w:t>Bekir Enes Çokbekler</w:t>
+              <w:t>Hüseyin Talha Seymenliler</w:t>
             </w:r>
           </w:p>
         </w:tc>
@@ -3799,7 +3820,7 @@
                 <w:rFonts w:ascii="Calibri"/>
                 <w:sz w:val="22"/>
               </w:rPr>
-              <w:t>becokbekler@student.ius.edu.ba</w:t>
+              <w:t>tseymenliler16@gmail.com</w:t>
             </w:r>
           </w:p>
         </w:tc>
@@ -3823,7 +3844,7 @@
                 <w:rFonts w:ascii="Calibri"/>
                 <w:sz w:val="22"/>
               </w:rPr>
-              <w:t>250302229</w:t>
+              <w:t>240302179</w:t>
             </w:r>
           </w:p>
         </w:tc>
@@ -3842,6 +3863,13 @@
                 <w:szCs w:val="20"/>
               </w:rPr>
             </w:pPr>
+            <w:r>
+              <w:rPr>
+                <w:rFonts w:ascii="Calibri"/>
+                <w:sz w:val="22"/>
+              </w:rPr>
+              <w:t/>
+            </w:r>
           </w:p>
         </w:tc>
       </w:tr>
@@ -3891,7 +3919,7 @@
                 <w:rFonts w:ascii="Calibri"/>
                 <w:sz w:val="22"/>
               </w:rPr>
-              <w:t>Bilal Yusuf Şimşek</w:t>
+              <w:t>Ferit Enes Seymenliler</w:t>
             </w:r>
           </w:p>
         </w:tc>
@@ -3915,7 +3943,7 @@
                 <w:rFonts w:ascii="Calibri"/>
                 <w:sz w:val="22"/>
               </w:rPr>
-              <w:t>Simsekbilal59@gmail.com</w:t>
+              <w:t>eenesseymenliler@gmail.com</w:t>
             </w:r>
           </w:p>
         </w:tc>
@@ -3939,7 +3967,7 @@
                 <w:rFonts w:ascii="Calibri"/>
                 <w:sz w:val="22"/>
               </w:rPr>
-              <w:t>250302196</w:t>
+              <w:t>240302180</w:t>
             </w:r>
           </w:p>
         </w:tc>
@@ -3958,6 +3986,13 @@
                 <w:szCs w:val="20"/>
               </w:rPr>
             </w:pPr>
+            <w:r>
+              <w:rPr>
+                <w:rFonts w:ascii="Calibri"/>
+                <w:sz w:val="22"/>
+              </w:rPr>
+              <w:t/>
+            </w:r>
           </w:p>
         </w:tc>
       </w:tr>
@@ -4007,7 +4042,7 @@
                 <w:rFonts w:ascii="Calibri"/>
                 <w:sz w:val="22"/>
               </w:rPr>
-              <w:t>Nazlıcan Cebeci</w:t>
+              <w:t>Abdullah Uzun</w:t>
             </w:r>
           </w:p>
         </w:tc>
@@ -4031,7 +4066,7 @@
                 <w:rFonts w:ascii="Calibri"/>
                 <w:sz w:val="22"/>
               </w:rPr>
-              <w:t>nazlii.cebeci@gmail.com</w:t>
+              <w:t>250201110@student.ius.edu.ba</w:t>
             </w:r>
           </w:p>
         </w:tc>
@@ -4055,7 +4090,7 @@
                 <w:rFonts w:ascii="Calibri"/>
                 <w:sz w:val="22"/>
               </w:rPr>
-              <w:t>250302243</w:t>
+              <w:t>250201110</w:t>
             </w:r>
           </w:p>
         </w:tc>
@@ -4074,6 +4109,13 @@
                 <w:szCs w:val="20"/>
               </w:rPr>
             </w:pPr>
+            <w:r>
+              <w:rPr>
+                <w:rFonts w:ascii="Calibri"/>
+                <w:sz w:val="22"/>
+              </w:rPr>
+              <w:t/>
+            </w:r>
           </w:p>
         </w:tc>
       </w:tr>
@@ -4123,7 +4165,7 @@
                 <w:rFonts w:ascii="Calibri"/>
                 <w:sz w:val="22"/>
               </w:rPr>
-              <w:t>Muhammed Emin Tiryaki</w:t>
+              <w:t>Ömer Arif Açıkel</w:t>
             </w:r>
           </w:p>
         </w:tc>
@@ -4147,7 +4189,7 @@
                 <w:rFonts w:ascii="Calibri"/>
                 <w:sz w:val="22"/>
               </w:rPr>
-              <w:t>metiryaki@student.ius.edu.ba</w:t>
+              <w:t>o.arifacikel@gmail.com</w:t>
             </w:r>
           </w:p>
         </w:tc>
@@ -4171,7 +4213,7 @@
                 <w:rFonts w:ascii="Calibri"/>
                 <w:sz w:val="22"/>
               </w:rPr>
-              <w:t>250302247</w:t>
+              <w:t>250302232</w:t>
             </w:r>
           </w:p>
         </w:tc>
@@ -4190,6 +4232,13 @@
                 <w:szCs w:val="20"/>
               </w:rPr>
             </w:pPr>
+            <w:r>
+              <w:rPr>
+                <w:rFonts w:ascii="Calibri"/>
+                <w:sz w:val="22"/>
+              </w:rPr>
+              <w:t/>
+            </w:r>
           </w:p>
         </w:tc>
       </w:tr>
@@ -4239,7 +4288,7 @@
                 <w:rFonts w:ascii="Calibri"/>
                 <w:sz w:val="22"/>
               </w:rPr>
-              <w:t>Emin Efe Duman</w:t>
+              <w:t>Nazlıcan Cebeci</w:t>
             </w:r>
           </w:p>
         </w:tc>
@@ -4263,7 +4312,7 @@
                 <w:rFonts w:ascii="Calibri"/>
                 <w:sz w:val="22"/>
               </w:rPr>
-              <w:t>emnfdmn@gmail.com</w:t>
+              <w:t>nazlii.cebeci@gmail.com</w:t>
             </w:r>
           </w:p>
         </w:tc>
@@ -4287,7 +4336,7 @@
                 <w:rFonts w:ascii="Calibri"/>
                 <w:sz w:val="22"/>
               </w:rPr>
-              <w:t>250302211</w:t>
+              <w:t>250302243</w:t>
             </w:r>
           </w:p>
         </w:tc>
@@ -4306,6 +4355,13 @@
                 <w:szCs w:val="20"/>
               </w:rPr>
             </w:pPr>
+            <w:r>
+              <w:rPr>
+                <w:rFonts w:ascii="Calibri"/>
+                <w:sz w:val="22"/>
+              </w:rPr>
+              <w:t/>
+            </w:r>
           </w:p>
         </w:tc>
       </w:tr>
@@ -4355,7 +4411,7 @@
                 <w:rFonts w:ascii="Calibri"/>
                 <w:sz w:val="22"/>
               </w:rPr>
-              <w:t>Bakir Bašić</w:t>
+              <w:t>Bilal Yusuf Şimşek</w:t>
             </w:r>
           </w:p>
         </w:tc>
@@ -4379,7 +4435,7 @@
                 <w:rFonts w:ascii="Calibri"/>
                 <w:sz w:val="22"/>
               </w:rPr>
-              <w:t>260302030@student.ius.edu.ba</w:t>
+              <w:t>Simsekbilal59@gmail.com</w:t>
             </w:r>
           </w:p>
         </w:tc>
@@ -4403,7 +4459,7 @@
                 <w:rFonts w:ascii="Calibri"/>
                 <w:sz w:val="22"/>
               </w:rPr>
-              <w:t>260302030</w:t>
+              <w:t>250302196</w:t>
             </w:r>
           </w:p>
         </w:tc>
@@ -4422,6 +4478,13 @@
                 <w:szCs w:val="20"/>
               </w:rPr>
             </w:pPr>
+            <w:r>
+              <w:rPr>
+                <w:rFonts w:ascii="Calibri"/>
+                <w:sz w:val="22"/>
+              </w:rPr>
+              <w:t/>
+            </w:r>
           </w:p>
         </w:tc>
       </w:tr>
@@ -4471,7 +4534,7 @@
                 <w:rFonts w:ascii="Calibri"/>
                 <w:sz w:val="22"/>
               </w:rPr>
-              <w:t>Ömer Arif Açıkel</w:t>
+              <w:t>Muhammed Emin Tiryaki</w:t>
             </w:r>
           </w:p>
         </w:tc>
@@ -4495,7 +4558,7 @@
                 <w:rFonts w:ascii="Calibri"/>
                 <w:sz w:val="22"/>
               </w:rPr>
-              <w:t>o.arifacikel@gmail.com</w:t>
+              <w:t>metiryaki@student.ius.edu.ba</w:t>
             </w:r>
           </w:p>
         </w:tc>
@@ -4519,7 +4582,7 @@
                 <w:rFonts w:ascii="Calibri"/>
                 <w:sz w:val="22"/>
               </w:rPr>
-              <w:t>250302232</w:t>
+              <w:t>250302247</w:t>
             </w:r>
           </w:p>
         </w:tc>
@@ -4538,6 +4601,13 @@
                 <w:szCs w:val="20"/>
               </w:rPr>
             </w:pPr>
+            <w:r>
+              <w:rPr>
+                <w:rFonts w:ascii="Calibri"/>
+                <w:sz w:val="22"/>
+              </w:rPr>
+              <w:t/>
+            </w:r>
           </w:p>
         </w:tc>
       </w:tr>
@@ -4563,7 +4633,7 @@
                 <w:rFonts w:ascii="Calibri"/>
                 <w:sz w:val="22"/>
               </w:rPr>
-              <w:t>11</w:t>
+              <w:t/>
             </w:r>
           </w:p>
         </w:tc>
@@ -4587,7 +4657,7 @@
                 <w:rFonts w:ascii="Calibri"/>
                 <w:sz w:val="22"/>
               </w:rPr>
-              <w:t>Mert Çınar Atalay</w:t>
+              <w:t/>
             </w:r>
           </w:p>
         </w:tc>
@@ -4611,7 +4681,7 @@
                 <w:rFonts w:ascii="Calibri"/>
                 <w:sz w:val="22"/>
               </w:rPr>
-              <w:t>atalayss301@gmail.com</w:t>
+              <w:t/>
             </w:r>
           </w:p>
         </w:tc>
@@ -4635,7 +4705,7 @@
                 <w:rFonts w:ascii="Calibri"/>
                 <w:sz w:val="22"/>
               </w:rPr>
-              <w:t>250302162</w:t>
+              <w:t/>
             </w:r>
           </w:p>
         </w:tc>
@@ -4654,6 +4724,13 @@
                 <w:szCs w:val="20"/>
               </w:rPr>
             </w:pPr>
+            <w:r>
+              <w:rPr>
+                <w:rFonts w:ascii="Calibri"/>
+                <w:sz w:val="22"/>
+              </w:rPr>
+              <w:t/>
+            </w:r>
           </w:p>
         </w:tc>
       </w:tr>
@@ -4679,7 +4756,7 @@
                 <w:rFonts w:ascii="Calibri"/>
                 <w:sz w:val="22"/>
               </w:rPr>
-              <w:t>12</w:t>
+              <w:t/>
             </w:r>
           </w:p>
         </w:tc>
@@ -4703,7 +4780,7 @@
                 <w:rFonts w:ascii="Calibri"/>
                 <w:sz w:val="22"/>
               </w:rPr>
-              <w:t>Ferit Enes Seymenliler</w:t>
+              <w:t/>
             </w:r>
           </w:p>
         </w:tc>
@@ -4727,7 +4804,7 @@
                 <w:rFonts w:ascii="Calibri"/>
                 <w:sz w:val="22"/>
               </w:rPr>
-              <w:t>eenesseymenliler@gmail.com</w:t>
+              <w:t/>
             </w:r>
           </w:p>
         </w:tc>
@@ -4751,7 +4828,7 @@
                 <w:rFonts w:ascii="Calibri"/>
                 <w:sz w:val="22"/>
               </w:rPr>
-              <w:t>240302180</w:t>
+              <w:t/>
             </w:r>
           </w:p>
         </w:tc>
@@ -4770,6 +4847,13 @@
                 <w:szCs w:val="20"/>
               </w:rPr>
             </w:pPr>
+            <w:r>
+              <w:rPr>
+                <w:rFonts w:ascii="Calibri"/>
+                <w:sz w:val="22"/>
+              </w:rPr>
+              <w:t/>
+            </w:r>
           </w:p>
         </w:tc>
       </w:tr>
@@ -4795,7 +4879,7 @@
                 <w:rFonts w:ascii="Calibri"/>
                 <w:sz w:val="22"/>
               </w:rPr>
-              <w:t>13</w:t>
+              <w:t/>
             </w:r>
           </w:p>
         </w:tc>
@@ -4819,7 +4903,7 @@
                 <w:rFonts w:ascii="Calibri"/>
                 <w:sz w:val="22"/>
               </w:rPr>
-              <w:t>Hüseyin Talha Seymenliler</w:t>
+              <w:t/>
             </w:r>
           </w:p>
         </w:tc>
@@ -4843,7 +4927,7 @@
                 <w:rFonts w:ascii="Calibri"/>
                 <w:sz w:val="22"/>
               </w:rPr>
-              <w:t>tseymenliler16@gmail.com</w:t>
+              <w:t/>
             </w:r>
           </w:p>
         </w:tc>
@@ -4867,7 +4951,7 @@
                 <w:rFonts w:ascii="Calibri"/>
                 <w:sz w:val="22"/>
               </w:rPr>
-              <w:t>240302179</w:t>
+              <w:t/>
             </w:r>
           </w:p>
         </w:tc>
@@ -4886,6 +4970,13 @@
                 <w:szCs w:val="20"/>
               </w:rPr>
             </w:pPr>
+            <w:r>
+              <w:rPr>
+                <w:rFonts w:ascii="Calibri"/>
+                <w:sz w:val="22"/>
+              </w:rPr>
+              <w:t/>
+            </w:r>
           </w:p>
         </w:tc>
       </w:tr>
@@ -4911,7 +5002,7 @@
                 <w:rFonts w:ascii="Calibri"/>
                 <w:sz w:val="22"/>
               </w:rPr>
-              <w:t>14</w:t>
+              <w:t/>
             </w:r>
           </w:p>
         </w:tc>
@@ -4935,7 +5026,7 @@
                 <w:rFonts w:ascii="Calibri"/>
                 <w:sz w:val="22"/>
               </w:rPr>
-              <w:t>Muhammed Efe Ural</w:t>
+              <w:t/>
             </w:r>
           </w:p>
         </w:tc>
@@ -4959,7 +5050,7 @@
                 <w:rFonts w:ascii="Calibri"/>
                 <w:sz w:val="22"/>
               </w:rPr>
-              <w:t>uralefe10@gmail.com</w:t>
+              <w:t/>
             </w:r>
           </w:p>
         </w:tc>
@@ -4983,7 +5074,7 @@
                 <w:rFonts w:ascii="Calibri"/>
                 <w:sz w:val="22"/>
               </w:rPr>
-              <w:t>240302169</w:t>
+              <w:t/>
             </w:r>
           </w:p>
         </w:tc>
@@ -5002,6 +5093,13 @@
                 <w:szCs w:val="20"/>
               </w:rPr>
             </w:pPr>
+            <w:r>
+              <w:rPr>
+                <w:rFonts w:ascii="Calibri"/>
+                <w:sz w:val="22"/>
+              </w:rPr>
+              <w:t/>
+            </w:r>
           </w:p>
         </w:tc>
       </w:tr>
@@ -5027,7 +5125,7 @@
                 <w:rFonts w:ascii="Calibri"/>
                 <w:sz w:val="22"/>
               </w:rPr>
-              <w:t>15</w:t>
+              <w:t/>
             </w:r>
           </w:p>
         </w:tc>
@@ -5051,7 +5149,7 @@
                 <w:rFonts w:ascii="Calibri"/>
                 <w:sz w:val="22"/>
               </w:rPr>
-              <w:t>Abdullah Uzun</w:t>
+              <w:t/>
             </w:r>
           </w:p>
         </w:tc>
@@ -5075,7 +5173,7 @@
                 <w:rFonts w:ascii="Calibri"/>
                 <w:sz w:val="22"/>
               </w:rPr>
-              <w:t>250201110@student.ius.edu.ba</w:t>
+              <w:t/>
             </w:r>
           </w:p>
         </w:tc>
@@ -5099,7 +5197,7 @@
                 <w:rFonts w:ascii="Calibri"/>
                 <w:sz w:val="22"/>
               </w:rPr>
-              <w:t>250201110</w:t>
+              <w:t/>
             </w:r>
           </w:p>
         </w:tc>
@@ -5118,6 +5216,13 @@
                 <w:szCs w:val="20"/>
               </w:rPr>
             </w:pPr>
+            <w:r>
+              <w:rPr>
+                <w:rFonts w:ascii="Calibri"/>
+                <w:sz w:val="22"/>
+              </w:rPr>
+              <w:t/>
+            </w:r>
           </w:p>
         </w:tc>
       </w:tr>
@@ -5143,7 +5248,7 @@
                 <w:rFonts w:ascii="Calibri"/>
                 <w:sz w:val="22"/>
               </w:rPr>
-              <w:t>16</w:t>
+              <w:t/>
             </w:r>
           </w:p>
         </w:tc>
@@ -5167,7 +5272,7 @@
                 <w:rFonts w:ascii="Calibri"/>
                 <w:sz w:val="22"/>
               </w:rPr>
-              <w:t>Ahmed Hadzimurati</w:t>
+              <w:t/>
             </w:r>
           </w:p>
         </w:tc>
@@ -5191,7 +5296,7 @@
                 <w:rFonts w:ascii="Calibri"/>
                 <w:sz w:val="22"/>
               </w:rPr>
-              <w:t>260302051@student.ius.edu.ba</w:t>
+              <w:t/>
             </w:r>
           </w:p>
         </w:tc>
@@ -5215,7 +5320,7 @@
                 <w:rFonts w:ascii="Calibri"/>
                 <w:sz w:val="22"/>
               </w:rPr>
-              <w:t>260302051</w:t>
+              <w:t/>
             </w:r>
           </w:p>
         </w:tc>
@@ -5234,6 +5339,13 @@
                 <w:szCs w:val="20"/>
               </w:rPr>
             </w:pPr>
+            <w:r>
+              <w:rPr>
+                <w:rFonts w:ascii="Calibri"/>
+                <w:sz w:val="22"/>
+              </w:rPr>
+              <w:t/>
+            </w:r>
           </w:p>
         </w:tc>
       </w:tr>
@@ -5256,10 +5368,10 @@
             </w:pPr>
             <w:r>
               <w:rPr>
-                <w:sz w:val="20"/>
-                <w:szCs w:val="20"/>
-              </w:rPr>
-              <w:t>17</w:t>
+                <w:rFonts w:ascii="Calibri"/>
+                <w:sz w:val="22"/>
+              </w:rPr>
+              <w:t/>
             </w:r>
           </w:p>
         </w:tc>
@@ -5278,6 +5390,13 @@
                 <w:szCs w:val="20"/>
               </w:rPr>
             </w:pPr>
+            <w:r>
+              <w:rPr>
+                <w:rFonts w:ascii="Calibri"/>
+                <w:sz w:val="22"/>
+              </w:rPr>
+              <w:t/>
+            </w:r>
           </w:p>
         </w:tc>
         <w:tc>
@@ -5295,6 +5414,13 @@
                 <w:szCs w:val="20"/>
               </w:rPr>
             </w:pPr>
+            <w:r>
+              <w:rPr>
+                <w:rFonts w:ascii="Calibri"/>
+                <w:sz w:val="22"/>
+              </w:rPr>
+              <w:t/>
+            </w:r>
           </w:p>
         </w:tc>
         <w:tc>
@@ -5312,6 +5438,13 @@
                 <w:szCs w:val="20"/>
               </w:rPr>
             </w:pPr>
+            <w:r>
+              <w:rPr>
+                <w:rFonts w:ascii="Calibri"/>
+                <w:sz w:val="22"/>
+              </w:rPr>
+              <w:t/>
+            </w:r>
           </w:p>
         </w:tc>
         <w:tc>
@@ -5329,6 +5462,13 @@
                 <w:szCs w:val="20"/>
               </w:rPr>
             </w:pPr>
+            <w:r>
+              <w:rPr>
+                <w:rFonts w:ascii="Calibri"/>
+                <w:sz w:val="22"/>
+              </w:rPr>
+              <w:t/>
+            </w:r>
           </w:p>
         </w:tc>
       </w:tr>
@@ -5351,10 +5491,10 @@
             </w:pPr>
             <w:r>
               <w:rPr>
-                <w:sz w:val="20"/>
-                <w:szCs w:val="20"/>
-              </w:rPr>
-              <w:t>18</w:t>
+                <w:rFonts w:ascii="Calibri"/>
+                <w:sz w:val="22"/>
+              </w:rPr>
+              <w:t/>
             </w:r>
           </w:p>
         </w:tc>
@@ -5373,6 +5513,13 @@
                 <w:szCs w:val="20"/>
               </w:rPr>
             </w:pPr>
+            <w:r>
+              <w:rPr>
+                <w:rFonts w:ascii="Calibri"/>
+                <w:sz w:val="22"/>
+              </w:rPr>
+              <w:t/>
+            </w:r>
           </w:p>
         </w:tc>
         <w:tc>
@@ -5390,6 +5537,13 @@
                 <w:szCs w:val="20"/>
               </w:rPr>
             </w:pPr>
+            <w:r>
+              <w:rPr>
+                <w:rFonts w:ascii="Calibri"/>
+                <w:sz w:val="22"/>
+              </w:rPr>
+              <w:t/>
+            </w:r>
           </w:p>
         </w:tc>
         <w:tc>
@@ -5407,6 +5561,13 @@
                 <w:szCs w:val="20"/>
               </w:rPr>
             </w:pPr>
+            <w:r>
+              <w:rPr>
+                <w:rFonts w:ascii="Calibri"/>
+                <w:sz w:val="22"/>
+              </w:rPr>
+              <w:t/>
+            </w:r>
           </w:p>
         </w:tc>
         <w:tc>
@@ -5424,6 +5585,13 @@
                 <w:szCs w:val="20"/>
               </w:rPr>
             </w:pPr>
+            <w:r>
+              <w:rPr>
+                <w:rFonts w:ascii="Calibri"/>
+                <w:sz w:val="22"/>
+              </w:rPr>
+              <w:t/>
+            </w:r>
           </w:p>
         </w:tc>
       </w:tr>
@@ -5446,10 +5614,10 @@
             </w:pPr>
             <w:r>
               <w:rPr>
-                <w:sz w:val="20"/>
-                <w:szCs w:val="20"/>
-              </w:rPr>
-              <w:t>19</w:t>
+                <w:rFonts w:ascii="Calibri"/>
+                <w:sz w:val="22"/>
+              </w:rPr>
+              <w:t/>
             </w:r>
           </w:p>
         </w:tc>
@@ -5468,6 +5636,13 @@
                 <w:szCs w:val="20"/>
               </w:rPr>
             </w:pPr>
+            <w:r>
+              <w:rPr>
+                <w:rFonts w:ascii="Calibri"/>
+                <w:sz w:val="22"/>
+              </w:rPr>
+              <w:t/>
+            </w:r>
           </w:p>
         </w:tc>
         <w:tc>
@@ -5485,6 +5660,13 @@
                 <w:szCs w:val="20"/>
               </w:rPr>
             </w:pPr>
+            <w:r>
+              <w:rPr>
+                <w:rFonts w:ascii="Calibri"/>
+                <w:sz w:val="22"/>
+              </w:rPr>
+              <w:t/>
+            </w:r>
           </w:p>
         </w:tc>
         <w:tc>
@@ -5502,6 +5684,13 @@
                 <w:szCs w:val="20"/>
               </w:rPr>
             </w:pPr>
+            <w:r>
+              <w:rPr>
+                <w:rFonts w:ascii="Calibri"/>
+                <w:sz w:val="22"/>
+              </w:rPr>
+              <w:t/>
+            </w:r>
           </w:p>
         </w:tc>
         <w:tc>
@@ -5519,6 +5708,13 @@
                 <w:szCs w:val="20"/>
               </w:rPr>
             </w:pPr>
+            <w:r>
+              <w:rPr>
+                <w:rFonts w:ascii="Calibri"/>
+                <w:sz w:val="22"/>
+              </w:rPr>
+              <w:t/>
+            </w:r>
           </w:p>
         </w:tc>
       </w:tr>
@@ -5541,10 +5737,10 @@
             </w:pPr>
             <w:r>
               <w:rPr>
-                <w:sz w:val="20"/>
-                <w:szCs w:val="20"/>
-              </w:rPr>
-              <w:t>20</w:t>
+                <w:rFonts w:ascii="Calibri"/>
+                <w:sz w:val="22"/>
+              </w:rPr>
+              <w:t/>
             </w:r>
           </w:p>
         </w:tc>
@@ -5563,6 +5759,13 @@
                 <w:szCs w:val="20"/>
               </w:rPr>
             </w:pPr>
+            <w:r>
+              <w:rPr>
+                <w:rFonts w:ascii="Calibri"/>
+                <w:sz w:val="22"/>
+              </w:rPr>
+              <w:t/>
+            </w:r>
           </w:p>
         </w:tc>
         <w:tc>
@@ -5580,6 +5783,13 @@
                 <w:szCs w:val="20"/>
               </w:rPr>
             </w:pPr>
+            <w:r>
+              <w:rPr>
+                <w:rFonts w:ascii="Calibri"/>
+                <w:sz w:val="22"/>
+              </w:rPr>
+              <w:t/>
+            </w:r>
           </w:p>
         </w:tc>
         <w:tc>
@@ -5597,6 +5807,13 @@
                 <w:szCs w:val="20"/>
               </w:rPr>
             </w:pPr>
+            <w:r>
+              <w:rPr>
+                <w:rFonts w:ascii="Calibri"/>
+                <w:sz w:val="22"/>
+              </w:rPr>
+              <w:t/>
+            </w:r>
           </w:p>
         </w:tc>
         <w:tc>
@@ -5614,6 +5831,13 @@
                 <w:szCs w:val="20"/>
               </w:rPr>
             </w:pPr>
+            <w:r>
+              <w:rPr>
+                <w:rFonts w:ascii="Calibri"/>
+                <w:sz w:val="22"/>
+              </w:rPr>
+              <w:t/>
+            </w:r>
           </w:p>
         </w:tc>
       </w:tr>

</xml_diff>

<commit_message>
feat: sync LinkedIn company setup (IUS-16 Done), Instagram stealth task (IUS-17), and update Observatory graph
</commit_message>
<xml_diff>
--- a/export_documents/student_club_registration_form_f252_FILLED.docx
+++ b/export_documents/student_club_registration_form_f252_FILLED.docx
@@ -3427,7 +3427,7 @@
                 <w:rFonts w:ascii="Calibri"/>
                 <w:sz w:val="22"/>
               </w:rPr>
-              <w:t>Emin Efe Duman</w:t>
+              <w:t>Kaan Mete Şenyıldız</w:t>
             </w:r>
           </w:p>
         </w:tc>
@@ -3451,7 +3451,7 @@
                 <w:rFonts w:ascii="Calibri"/>
                 <w:sz w:val="22"/>
               </w:rPr>
-              <w:t>emnfdmn@gmail.com</w:t>
+              <w:t>kmsenyildiz@gmail.com</w:t>
             </w:r>
           </w:p>
         </w:tc>
@@ -3475,7 +3475,7 @@
                 <w:rFonts w:ascii="Calibri"/>
                 <w:sz w:val="22"/>
               </w:rPr>
-              <w:t>250302211</w:t>
+              <w:t>250302201</w:t>
             </w:r>
           </w:p>
         </w:tc>
@@ -3550,7 +3550,7 @@
                 <w:rFonts w:ascii="Calibri"/>
                 <w:sz w:val="22"/>
               </w:rPr>
-              <w:t>Ahmed Hadzimurati</w:t>
+              <w:t>Hasan Kaan Karabulut</w:t>
             </w:r>
           </w:p>
         </w:tc>
@@ -3574,7 +3574,7 @@
                 <w:rFonts w:ascii="Calibri"/>
                 <w:sz w:val="22"/>
               </w:rPr>
-              <w:t>260302051@student.ius.edu.ba</w:t>
+              <w:t>hasankaankarabulut121@gmail.com</w:t>
             </w:r>
           </w:p>
         </w:tc>
@@ -3598,7 +3598,7 @@
                 <w:rFonts w:ascii="Calibri"/>
                 <w:sz w:val="22"/>
               </w:rPr>
-              <w:t>260302051</w:t>
+              <w:t>250302195</w:t>
             </w:r>
           </w:p>
         </w:tc>
@@ -3673,7 +3673,7 @@
                 <w:rFonts w:ascii="Calibri"/>
                 <w:sz w:val="22"/>
               </w:rPr>
-              <w:t>Muhammed Efe Ural</w:t>
+              <w:t>Mahmut İhsan Avcı</w:t>
             </w:r>
           </w:p>
         </w:tc>
@@ -3697,7 +3697,7 @@
                 <w:rFonts w:ascii="Calibri"/>
                 <w:sz w:val="22"/>
               </w:rPr>
-              <w:t>uralefe10@gmail.com</w:t>
+              <w:t>mahmut.ihsanavcii@gmail.com</w:t>
             </w:r>
           </w:p>
         </w:tc>
@@ -3721,7 +3721,7 @@
                 <w:rFonts w:ascii="Calibri"/>
                 <w:sz w:val="22"/>
               </w:rPr>
-              <w:t>240302169</w:t>
+              <w:t>250302233</w:t>
             </w:r>
           </w:p>
         </w:tc>
@@ -3796,7 +3796,7 @@
                 <w:rFonts w:ascii="Calibri"/>
                 <w:sz w:val="22"/>
               </w:rPr>
-              <w:t>Hüseyin Talha Seymenliler</w:t>
+              <w:t>Bekir Enes Çokbekler</w:t>
             </w:r>
           </w:p>
         </w:tc>
@@ -3820,7 +3820,7 @@
                 <w:rFonts w:ascii="Calibri"/>
                 <w:sz w:val="22"/>
               </w:rPr>
-              <w:t>tseymenliler16@gmail.com</w:t>
+              <w:t>becokbekler@student.ius.edu.ba</w:t>
             </w:r>
           </w:p>
         </w:tc>
@@ -3844,7 +3844,7 @@
                 <w:rFonts w:ascii="Calibri"/>
                 <w:sz w:val="22"/>
               </w:rPr>
-              <w:t>240302179</w:t>
+              <w:t>250302229</w:t>
             </w:r>
           </w:p>
         </w:tc>
@@ -3919,7 +3919,7 @@
                 <w:rFonts w:ascii="Calibri"/>
                 <w:sz w:val="22"/>
               </w:rPr>
-              <w:t>Ferit Enes Seymenliler</w:t>
+              <w:t>Bakir Bašić</w:t>
             </w:r>
           </w:p>
         </w:tc>
@@ -3943,7 +3943,7 @@
                 <w:rFonts w:ascii="Calibri"/>
                 <w:sz w:val="22"/>
               </w:rPr>
-              <w:t>eenesseymenliler@gmail.com</w:t>
+              <w:t>260302030@student.ius.edu.ba</w:t>
             </w:r>
           </w:p>
         </w:tc>
@@ -3967,7 +3967,7 @@
                 <w:rFonts w:ascii="Calibri"/>
                 <w:sz w:val="22"/>
               </w:rPr>
-              <w:t>240302180</w:t>
+              <w:t>260302030</w:t>
             </w:r>
           </w:p>
         </w:tc>
@@ -4042,7 +4042,7 @@
                 <w:rFonts w:ascii="Calibri"/>
                 <w:sz w:val="22"/>
               </w:rPr>
-              <w:t>Abdullah Uzun</w:t>
+              <w:t>Emin Efe Duman</w:t>
             </w:r>
           </w:p>
         </w:tc>
@@ -4066,7 +4066,7 @@
                 <w:rFonts w:ascii="Calibri"/>
                 <w:sz w:val="22"/>
               </w:rPr>
-              <w:t>250201110@student.ius.edu.ba</w:t>
+              <w:t>emnfdmn@gmail.com</w:t>
             </w:r>
           </w:p>
         </w:tc>
@@ -4090,7 +4090,7 @@
                 <w:rFonts w:ascii="Calibri"/>
                 <w:sz w:val="22"/>
               </w:rPr>
-              <w:t>250201110</w:t>
+              <w:t>250302211</w:t>
             </w:r>
           </w:p>
         </w:tc>
@@ -4165,7 +4165,7 @@
                 <w:rFonts w:ascii="Calibri"/>
                 <w:sz w:val="22"/>
               </w:rPr>
-              <w:t>Ömer Arif Açıkel</w:t>
+              <w:t>Ahmed Hadzimurati</w:t>
             </w:r>
           </w:p>
         </w:tc>
@@ -4189,7 +4189,7 @@
                 <w:rFonts w:ascii="Calibri"/>
                 <w:sz w:val="22"/>
               </w:rPr>
-              <w:t>o.arifacikel@gmail.com</w:t>
+              <w:t>260302051@student.ius.edu.ba</w:t>
             </w:r>
           </w:p>
         </w:tc>
@@ -4213,7 +4213,7 @@
                 <w:rFonts w:ascii="Calibri"/>
                 <w:sz w:val="22"/>
               </w:rPr>
-              <w:t>250302232</w:t>
+              <w:t>260302051</w:t>
             </w:r>
           </w:p>
         </w:tc>
@@ -4288,7 +4288,7 @@
                 <w:rFonts w:ascii="Calibri"/>
                 <w:sz w:val="22"/>
               </w:rPr>
-              <w:t>Nazlıcan Cebeci</w:t>
+              <w:t>Muhammed Efe Ural</w:t>
             </w:r>
           </w:p>
         </w:tc>
@@ -4312,7 +4312,7 @@
                 <w:rFonts w:ascii="Calibri"/>
                 <w:sz w:val="22"/>
               </w:rPr>
-              <w:t>nazlii.cebeci@gmail.com</w:t>
+              <w:t>uralefe10@gmail.com</w:t>
             </w:r>
           </w:p>
         </w:tc>
@@ -4336,7 +4336,7 @@
                 <w:rFonts w:ascii="Calibri"/>
                 <w:sz w:val="22"/>
               </w:rPr>
-              <w:t>250302243</w:t>
+              <w:t>240302169</w:t>
             </w:r>
           </w:p>
         </w:tc>
@@ -4411,7 +4411,7 @@
                 <w:rFonts w:ascii="Calibri"/>
                 <w:sz w:val="22"/>
               </w:rPr>
-              <w:t>Bilal Yusuf Şimşek</w:t>
+              <w:t>Hüseyin Talha Seymenliler</w:t>
             </w:r>
           </w:p>
         </w:tc>
@@ -4435,7 +4435,7 @@
                 <w:rFonts w:ascii="Calibri"/>
                 <w:sz w:val="22"/>
               </w:rPr>
-              <w:t>Simsekbilal59@gmail.com</w:t>
+              <w:t>tseymenliler16@gmail.com</w:t>
             </w:r>
           </w:p>
         </w:tc>
@@ -4459,7 +4459,7 @@
                 <w:rFonts w:ascii="Calibri"/>
                 <w:sz w:val="22"/>
               </w:rPr>
-              <w:t>250302196</w:t>
+              <w:t>240302179</w:t>
             </w:r>
           </w:p>
         </w:tc>
@@ -4534,7 +4534,7 @@
                 <w:rFonts w:ascii="Calibri"/>
                 <w:sz w:val="22"/>
               </w:rPr>
-              <w:t>Muhammed Emin Tiryaki</w:t>
+              <w:t>Ferit Enes Seymenliler</w:t>
             </w:r>
           </w:p>
         </w:tc>
@@ -4558,7 +4558,7 @@
                 <w:rFonts w:ascii="Calibri"/>
                 <w:sz w:val="22"/>
               </w:rPr>
-              <w:t>metiryaki@student.ius.edu.ba</w:t>
+              <w:t>eenesseymenliler@gmail.com</w:t>
             </w:r>
           </w:p>
         </w:tc>
@@ -4582,7 +4582,7 @@
                 <w:rFonts w:ascii="Calibri"/>
                 <w:sz w:val="22"/>
               </w:rPr>
-              <w:t>250302247</w:t>
+              <w:t>240302180</w:t>
             </w:r>
           </w:p>
         </w:tc>
@@ -4633,7 +4633,7 @@
                 <w:rFonts w:ascii="Calibri"/>
                 <w:sz w:val="22"/>
               </w:rPr>
-              <w:t/>
+              <w:t>11</w:t>
             </w:r>
           </w:p>
         </w:tc>
@@ -4657,7 +4657,7 @@
                 <w:rFonts w:ascii="Calibri"/>
                 <w:sz w:val="22"/>
               </w:rPr>
-              <w:t/>
+              <w:t>Abdullah Uzun</w:t>
             </w:r>
           </w:p>
         </w:tc>
@@ -4681,7 +4681,7 @@
                 <w:rFonts w:ascii="Calibri"/>
                 <w:sz w:val="22"/>
               </w:rPr>
-              <w:t/>
+              <w:t>250201110@student.ius.edu.ba</w:t>
             </w:r>
           </w:p>
         </w:tc>
@@ -4705,7 +4705,7 @@
                 <w:rFonts w:ascii="Calibri"/>
                 <w:sz w:val="22"/>
               </w:rPr>
-              <w:t/>
+              <w:t>250201110</w:t>
             </w:r>
           </w:p>
         </w:tc>
@@ -4756,7 +4756,7 @@
                 <w:rFonts w:ascii="Calibri"/>
                 <w:sz w:val="22"/>
               </w:rPr>
-              <w:t/>
+              <w:t>12</w:t>
             </w:r>
           </w:p>
         </w:tc>
@@ -4780,7 +4780,7 @@
                 <w:rFonts w:ascii="Calibri"/>
                 <w:sz w:val="22"/>
               </w:rPr>
-              <w:t/>
+              <w:t>Ömer Arif Açıkel</w:t>
             </w:r>
           </w:p>
         </w:tc>
@@ -4804,7 +4804,7 @@
                 <w:rFonts w:ascii="Calibri"/>
                 <w:sz w:val="22"/>
               </w:rPr>
-              <w:t/>
+              <w:t>o.arifacikel@gmail.com</w:t>
             </w:r>
           </w:p>
         </w:tc>
@@ -4828,7 +4828,7 @@
                 <w:rFonts w:ascii="Calibri"/>
                 <w:sz w:val="22"/>
               </w:rPr>
-              <w:t/>
+              <w:t>250302232</w:t>
             </w:r>
           </w:p>
         </w:tc>
@@ -4879,7 +4879,7 @@
                 <w:rFonts w:ascii="Calibri"/>
                 <w:sz w:val="22"/>
               </w:rPr>
-              <w:t/>
+              <w:t>13</w:t>
             </w:r>
           </w:p>
         </w:tc>
@@ -4903,7 +4903,7 @@
                 <w:rFonts w:ascii="Calibri"/>
                 <w:sz w:val="22"/>
               </w:rPr>
-              <w:t/>
+              <w:t>Nazlıcan Cebeci</w:t>
             </w:r>
           </w:p>
         </w:tc>
@@ -4927,7 +4927,7 @@
                 <w:rFonts w:ascii="Calibri"/>
                 <w:sz w:val="22"/>
               </w:rPr>
-              <w:t/>
+              <w:t>nazlii.cebeci@gmail.com</w:t>
             </w:r>
           </w:p>
         </w:tc>
@@ -4951,7 +4951,7 @@
                 <w:rFonts w:ascii="Calibri"/>
                 <w:sz w:val="22"/>
               </w:rPr>
-              <w:t/>
+              <w:t>250302243</w:t>
             </w:r>
           </w:p>
         </w:tc>
@@ -5002,7 +5002,7 @@
                 <w:rFonts w:ascii="Calibri"/>
                 <w:sz w:val="22"/>
               </w:rPr>
-              <w:t/>
+              <w:t>14</w:t>
             </w:r>
           </w:p>
         </w:tc>
@@ -5026,7 +5026,7 @@
                 <w:rFonts w:ascii="Calibri"/>
                 <w:sz w:val="22"/>
               </w:rPr>
-              <w:t/>
+              <w:t>Bilal Yusuf Şimşek</w:t>
             </w:r>
           </w:p>
         </w:tc>
@@ -5050,7 +5050,7 @@
                 <w:rFonts w:ascii="Calibri"/>
                 <w:sz w:val="22"/>
               </w:rPr>
-              <w:t/>
+              <w:t>Simsekbilal59@gmail.com</w:t>
             </w:r>
           </w:p>
         </w:tc>
@@ -5074,7 +5074,7 @@
                 <w:rFonts w:ascii="Calibri"/>
                 <w:sz w:val="22"/>
               </w:rPr>
-              <w:t/>
+              <w:t>250302196</w:t>
             </w:r>
           </w:p>
         </w:tc>
@@ -5125,7 +5125,7 @@
                 <w:rFonts w:ascii="Calibri"/>
                 <w:sz w:val="22"/>
               </w:rPr>
-              <w:t/>
+              <w:t>15</w:t>
             </w:r>
           </w:p>
         </w:tc>
@@ -5149,7 +5149,7 @@
                 <w:rFonts w:ascii="Calibri"/>
                 <w:sz w:val="22"/>
               </w:rPr>
-              <w:t/>
+              <w:t>Muhammed Emin Tiryaki</w:t>
             </w:r>
           </w:p>
         </w:tc>
@@ -5173,7 +5173,7 @@
                 <w:rFonts w:ascii="Calibri"/>
                 <w:sz w:val="22"/>
               </w:rPr>
-              <w:t/>
+              <w:t>metiryaki@student.ius.edu.ba</w:t>
             </w:r>
           </w:p>
         </w:tc>
@@ -5197,7 +5197,7 @@
                 <w:rFonts w:ascii="Calibri"/>
                 <w:sz w:val="22"/>
               </w:rPr>
-              <w:t/>
+              <w:t>250302247</w:t>
             </w:r>
           </w:p>
         </w:tc>
@@ -5248,7 +5248,7 @@
                 <w:rFonts w:ascii="Calibri"/>
                 <w:sz w:val="22"/>
               </w:rPr>
-              <w:t/>
+              <w:t>16</w:t>
             </w:r>
           </w:p>
         </w:tc>
@@ -5272,7 +5272,7 @@
                 <w:rFonts w:ascii="Calibri"/>
                 <w:sz w:val="22"/>
               </w:rPr>
-              <w:t/>
+              <w:t>Işıl Irmak Cihan</w:t>
             </w:r>
           </w:p>
         </w:tc>
@@ -5296,7 +5296,7 @@
                 <w:rFonts w:ascii="Calibri"/>
                 <w:sz w:val="22"/>
               </w:rPr>
-              <w:t/>
+              <w:t>irmaksecil1@gmail.com</w:t>
             </w:r>
           </w:p>
         </w:tc>
@@ -5320,7 +5320,7 @@
                 <w:rFonts w:ascii="Calibri"/>
                 <w:sz w:val="22"/>
               </w:rPr>
-              <w:t/>
+              <w:t>240302254</w:t>
             </w:r>
           </w:p>
         </w:tc>
@@ -5371,7 +5371,7 @@
                 <w:rFonts w:ascii="Calibri"/>
                 <w:sz w:val="22"/>
               </w:rPr>
-              <w:t/>
+              <w:t>17</w:t>
             </w:r>
           </w:p>
         </w:tc>
@@ -5494,7 +5494,7 @@
                 <w:rFonts w:ascii="Calibri"/>
                 <w:sz w:val="22"/>
               </w:rPr>
-              <w:t/>
+              <w:t>18</w:t>
             </w:r>
           </w:p>
         </w:tc>
@@ -5617,7 +5617,7 @@
                 <w:rFonts w:ascii="Calibri"/>
                 <w:sz w:val="22"/>
               </w:rPr>
-              <w:t/>
+              <w:t>19</w:t>
             </w:r>
           </w:p>
         </w:tc>
@@ -5740,7 +5740,7 @@
                 <w:rFonts w:ascii="Calibri"/>
                 <w:sz w:val="22"/>
               </w:rPr>
-              <w:t/>
+              <w:t>20</w:t>
             </w:r>
           </w:p>
         </w:tc>

</xml_diff>